<commit_message>
Add product walkthrough slide and narration pipeline
- Deck is now 10 slides: new walkthrough slide with screenshots of the
  running dashboard; slide 1 timing line corrected.
- scripts/build_narrated_deck.py turns the speaker notes into audio
  (Windows speech voices), embeds one clip per slide with auto-advance and
  exports a narrated PPTX and MP4. narration_script.md is the script.
- Large media is gitignored and shipped in the submission package.

Co-Authored-By: Claude Sonnet 5.5 <noreply@anthropic.com>
</commit_message>
<xml_diff>
--- a/Topic_7_Final_Capstone_Deliverable.docx
+++ b/Topic_7_Final_Capstone_Deliverable.docx
@@ -2937,7 +2937,39 @@
           <w:color w:val="282828"/>
           <w:sz w:val="22"/>
         </w:rPr>
-        <w:t>, 9 slides, with speaker notes) follows the structure of this report. Every number on the slides is read from the notebook's saved metrics.</w:t>
+        <w:t xml:space="preserve">, 10 slides, with speaker notes) follows the structure of this report. A narrated version with audio on every slide is provided as </w:t>
+      </w:r>
+      <w:r>
+        <w:rPr>
+          <w:rFonts w:ascii="Consolas" w:hAnsi="Consolas"/>
+          <w:color w:val="962828"/>
+          <w:sz w:val="19"/>
+        </w:rPr>
+        <w:t>Topic_7_Capstone_Presentation_Narrated.pptx</w:t>
+      </w:r>
+      <w:r>
+        <w:rPr>
+          <w:rFonts w:ascii="Calibri" w:hAnsi="Calibri"/>
+          <w:color w:val="282828"/>
+          <w:sz w:val="22"/>
+        </w:rPr>
+        <w:t xml:space="preserve"> and </w:t>
+      </w:r>
+      <w:r>
+        <w:rPr>
+          <w:rFonts w:ascii="Consolas" w:hAnsi="Consolas"/>
+          <w:color w:val="962828"/>
+          <w:sz w:val="19"/>
+        </w:rPr>
+        <w:t>.mp4</w:t>
+      </w:r>
+      <w:r>
+        <w:rPr>
+          <w:rFonts w:ascii="Calibri" w:hAnsi="Calibri"/>
+          <w:color w:val="282828"/>
+          <w:sz w:val="22"/>
+        </w:rPr>
+        <w:t>. Every number on the slides is read from the notebook's saved metrics.</w:t>
       </w:r>
     </w:p>
     <w:tbl>
@@ -3209,7 +3241,7 @@
                 <w:color w:val="282828"/>
                 <w:sz w:val="18"/>
               </w:rPr>
-              <w:t>Each patient is a 24-hour record reduced to 11 clinical features</w:t>
+              <w:t>Clinicians see the stage, the reasons and a review flag</w:t>
             </w:r>
           </w:p>
         </w:tc>
@@ -3226,7 +3258,7 @@
                 <w:color w:val="282828"/>
                 <w:sz w:val="18"/>
               </w:rPr>
-              <w:t>Mean 24-hour systolic profiles</w:t>
+              <w:t>Screenshots of the running dashboard</w:t>
             </w:r>
           </w:p>
         </w:tc>
@@ -3263,7 +3295,7 @@
                 <w:color w:val="282828"/>
                 <w:sz w:val="18"/>
               </w:rPr>
-              <w:t>Cross-validation chose the model; the holdout chose nothing</w:t>
+              <w:t>Each patient is a 24-hour record reduced to 11 clinical features</w:t>
             </w:r>
           </w:p>
         </w:tc>
@@ -3279,7 +3311,7 @@
                 <w:color w:val="282828"/>
                 <w:sz w:val="18"/>
               </w:rPr>
-              <w:t>Selection chart</w:t>
+              <w:t>Mean 24-hour systolic profiles</w:t>
             </w:r>
           </w:p>
         </w:tc>
@@ -3318,7 +3350,7 @@
                 <w:color w:val="282828"/>
                 <w:sz w:val="18"/>
               </w:rPr>
-              <w:t>90.2% accuracy and 97% Stage 2 recall, with the uncertainty shown</w:t>
+              <w:t>Cross-validation chose the model; the holdout chose nothing</w:t>
             </w:r>
           </w:p>
         </w:tc>
@@ -3335,7 +3367,7 @@
                 <w:color w:val="282828"/>
                 <w:sz w:val="18"/>
               </w:rPr>
-              <w:t>Benchmark chart with intervals</w:t>
+              <w:t>Selection chart</w:t>
             </w:r>
           </w:p>
         </w:tc>
@@ -3372,7 +3404,7 @@
                 <w:color w:val="282828"/>
                 <w:sz w:val="18"/>
               </w:rPr>
-              <w:t>The audit found real gaps between the claims and the code</w:t>
+              <w:t>90.2% accuracy and 97% Stage 2 recall, with the uncertainty shown</w:t>
             </w:r>
           </w:p>
         </w:tc>
@@ -3388,7 +3420,7 @@
                 <w:color w:val="282828"/>
                 <w:sz w:val="18"/>
               </w:rPr>
-              <w:t>Findings table</w:t>
+              <w:t>Benchmark chart with intervals</w:t>
             </w:r>
           </w:p>
         </w:tc>
@@ -3427,7 +3459,7 @@
                 <w:color w:val="282828"/>
                 <w:sz w:val="18"/>
               </w:rPr>
-              <w:t>Where it fails: near stage cut-points, and for younger patients</w:t>
+              <w:t>The audit found real gaps between the claims and the code</w:t>
             </w:r>
           </w:p>
         </w:tc>
@@ -3444,7 +3476,7 @@
                 <w:color w:val="282828"/>
                 <w:sz w:val="18"/>
               </w:rPr>
-              <w:t>Error and subgroup charts</w:t>
+              <w:t>Findings table</w:t>
             </w:r>
           </w:p>
         </w:tc>
@@ -3481,6 +3513,61 @@
                 <w:color w:val="282828"/>
                 <w:sz w:val="18"/>
               </w:rPr>
+              <w:t>Where it fails: near stage cut-points, and for younger patients</w:t>
+            </w:r>
+          </w:p>
+        </w:tc>
+        <w:tc>
+          <w:tcPr>
+            <w:tcW w:type="dxa" w:w="3312"/>
+          </w:tcPr>
+          <w:p>
+            <w:r/>
+            <w:r>
+              <w:rPr>
+                <w:rFonts w:ascii="Calibri" w:hAnsi="Calibri"/>
+                <w:color w:val="282828"/>
+                <w:sz w:val="18"/>
+              </w:rPr>
+              <w:t>Error and subgroup charts</w:t>
+            </w:r>
+          </w:p>
+        </w:tc>
+      </w:tr>
+      <w:tr>
+        <w:trPr>
+          <w:cantSplit/>
+        </w:trPr>
+        <w:tc>
+          <w:tcPr>
+            <w:tcW w:type="dxa" w:w="720"/>
+            <w:shd w:val="clear" w:color="auto" w:fill="EEF3F8"/>
+          </w:tcPr>
+          <w:p>
+            <w:r/>
+            <w:r>
+              <w:rPr>
+                <w:rFonts w:ascii="Calibri" w:hAnsi="Calibri"/>
+                <w:color w:val="282828"/>
+                <w:sz w:val="18"/>
+              </w:rPr>
+              <w:t>10</w:t>
+            </w:r>
+          </w:p>
+        </w:tc>
+        <w:tc>
+          <w:tcPr>
+            <w:tcW w:type="dxa" w:w="5328"/>
+            <w:shd w:val="clear" w:color="auto" w:fill="EEF3F8"/>
+          </w:tcPr>
+          <w:p>
+            <w:r/>
+            <w:r>
+              <w:rPr>
+                <w:rFonts w:ascii="Calibri" w:hAnsi="Calibri"/>
+                <w:color w:val="282828"/>
+                <w:sz w:val="18"/>
+              </w:rPr>
               <w:t>Next: prove it on real data, then predict outcomes</w:t>
             </w:r>
           </w:p>
@@ -3488,6 +3575,7 @@
         <w:tc>
           <w:tcPr>
             <w:tcW w:type="dxa" w:w="3312"/>
+            <w:shd w:val="clear" w:color="auto" w:fill="EEF3F8"/>
           </w:tcPr>
           <w:p>
             <w:r/>

</xml_diff>